<commit_message>
fix: enforce SQL identities, payroll integrity and align docs
</commit_message>
<xml_diff>
--- a/docs/Ke_hoach_phan_cong_Project_DBMS_Nhom06.docx
+++ b/docs/Ke_hoach_phan_cong_Project_DBMS_Nhom06.docx
@@ -1026,6 +1026,14 @@
         </w:tc>
       </w:tr>
     </w:tbl>
+    <w:p>
+      <w:pPr>
+        <w:spacing w:after="120"/>
+      </w:pPr>
+      <w:r>
+        <w:t>Cập nhật hiện thực ngày 08/10/2026: bổ sung LICHSULUONG, NgayNghiViec, mapping SqlLogin và PBKDF2. Bộ mật khẩu demo dùng chung ở database/demo_accounts.json; kịch bản giao diện ở docs/GUI_TEST_GUIDE.md. Kế hoạch tuần không thay thế log xác minh tại docs/FIX_TASKLIST.md.</w:t>
+      </w:r>
+    </w:p>
     <w:p>
       <w:pPr>
         <w:pStyle w:val="Heading1"/>
@@ -1379,19 +1387,7 @@
                 <w:rFonts w:ascii="Times New Roman" w:hAnsi="Times New Roman"/>
                 <w:sz w:val="17"/>
               </w:rPr>
-            </w:r>
-          </w:p>
-          <w:p>
-            <w:pPr>
-              <w:pStyle w:val="ListBullet"/>
-              <w:spacing w:after="20" w:before="0" w:line="240" w:lineRule="auto"/>
-            </w:pPr>
-            <w:r>
-              <w:rPr>
-                <w:rFonts w:ascii="Times New Roman" w:hAnsi="Times New Roman"/>
-                <w:sz w:val="17"/>
-              </w:rPr>
-              <w:t>Rà soát mục tiêu, phạm vi, tác nhân và Use Case của hệ thống quản lý nhân sự – tiền lương.</w:t>
+              <w:t>• Rà soát mục tiêu, phạm vi, tác nhân và Use Case của hệ thống quản lý nhân sự – tiền lương.</w:t>
             </w:r>
           </w:p>
           <w:p>
@@ -1479,19 +1475,7 @@
                 <w:rFonts w:ascii="Times New Roman" w:hAnsi="Times New Roman"/>
                 <w:sz w:val="17"/>
               </w:rPr>
-            </w:r>
-          </w:p>
-          <w:p>
-            <w:pPr>
-              <w:pStyle w:val="ListBullet"/>
-              <w:spacing w:after="20" w:before="0" w:line="240" w:lineRule="auto"/>
-            </w:pPr>
-            <w:r>
-              <w:rPr>
-                <w:rFonts w:ascii="Times New Roman" w:hAnsi="Times New Roman"/>
-                <w:sz w:val="17"/>
-              </w:rPr>
-              <w:t>ERD phiên bản chốt.</w:t>
+              <w:t>• ERD phiên bản chốt.</w:t>
             </w:r>
           </w:p>
           <w:p>
@@ -1655,19 +1639,7 @@
                 <w:rFonts w:ascii="Times New Roman" w:hAnsi="Times New Roman"/>
                 <w:sz w:val="17"/>
               </w:rPr>
-            </w:r>
-          </w:p>
-          <w:p>
-            <w:pPr>
-              <w:pStyle w:val="ListBullet"/>
-              <w:spacing w:after="20" w:before="0" w:line="240" w:lineRule="auto"/>
-            </w:pPr>
-            <w:r>
-              <w:rPr>
-                <w:rFonts w:ascii="Times New Roman" w:hAnsi="Times New Roman"/>
-                <w:sz w:val="17"/>
-              </w:rPr>
-              <w:t>Phân tích nghiệp vụ chấm công theo cặp nhân viên – ngày.</w:t>
+              <w:t>• Phân tích nghiệp vụ chấm công theo cặp nhân viên – ngày.</w:t>
             </w:r>
           </w:p>
           <w:p>
@@ -1755,19 +1727,7 @@
                 <w:rFonts w:ascii="Times New Roman" w:hAnsi="Times New Roman"/>
                 <w:sz w:val="17"/>
               </w:rPr>
-            </w:r>
-          </w:p>
-          <w:p>
-            <w:pPr>
-              <w:pStyle w:val="ListBullet"/>
-              <w:spacing w:after="20" w:before="0" w:line="240" w:lineRule="auto"/>
-            </w:pPr>
-            <w:r>
-              <w:rPr>
-                <w:rFonts w:ascii="Times New Roman" w:hAnsi="Times New Roman"/>
-                <w:sz w:val="17"/>
-              </w:rPr>
-              <w:t>Đặc tả nghiệp vụ chấm công.</w:t>
+              <w:t>• Đặc tả nghiệp vụ chấm công.</w:t>
             </w:r>
           </w:p>
           <w:p>
@@ -1931,19 +1891,7 @@
                 <w:rFonts w:ascii="Times New Roman" w:hAnsi="Times New Roman"/>
                 <w:sz w:val="17"/>
               </w:rPr>
-            </w:r>
-          </w:p>
-          <w:p>
-            <w:pPr>
-              <w:pStyle w:val="ListBullet"/>
-              <w:spacing w:after="20" w:before="0" w:line="240" w:lineRule="auto"/>
-            </w:pPr>
-            <w:r>
-              <w:rPr>
-                <w:rFonts w:ascii="Times New Roman" w:hAnsi="Times New Roman"/>
-                <w:sz w:val="17"/>
-              </w:rPr>
-              <w:t>Phân tích nghiệp vụ phụ cấp và khấu trừ theo nhân viên, tháng, năm.</w:t>
+              <w:t>• Phân tích nghiệp vụ phụ cấp và khấu trừ theo nhân viên, tháng, năm.</w:t>
             </w:r>
           </w:p>
           <w:p>
@@ -2031,19 +1979,7 @@
                 <w:rFonts w:ascii="Times New Roman" w:hAnsi="Times New Roman"/>
                 <w:sz w:val="17"/>
               </w:rPr>
-            </w:r>
-          </w:p>
-          <w:p>
-            <w:pPr>
-              <w:pStyle w:val="ListBullet"/>
-              <w:spacing w:after="20" w:before="0" w:line="240" w:lineRule="auto"/>
-            </w:pPr>
-            <w:r>
-              <w:rPr>
-                <w:rFonts w:ascii="Times New Roman" w:hAnsi="Times New Roman"/>
-                <w:sz w:val="17"/>
-              </w:rPr>
-              <w:t>Đặc tả nghiệp vụ phụ cấp/khấu trừ.</w:t>
+              <w:t>• Đặc tả nghiệp vụ phụ cấp/khấu trừ.</w:t>
             </w:r>
           </w:p>
           <w:p>
@@ -2207,19 +2143,7 @@
                 <w:rFonts w:ascii="Times New Roman" w:hAnsi="Times New Roman"/>
                 <w:sz w:val="17"/>
               </w:rPr>
-            </w:r>
-          </w:p>
-          <w:p>
-            <w:pPr>
-              <w:pStyle w:val="ListBullet"/>
-              <w:spacing w:after="20" w:before="0" w:line="240" w:lineRule="auto"/>
-            </w:pPr>
-            <w:r>
-              <w:rPr>
-                <w:rFonts w:ascii="Times New Roman" w:hAnsi="Times New Roman"/>
-                <w:sz w:val="17"/>
-              </w:rPr>
-              <w:t>Phân tích luồng tính lương từ chấm công + phụ cấp – khấu trừ.</w:t>
+              <w:t>• Phân tích luồng tính lương từ chấm công + phụ cấp – khấu trừ.</w:t>
             </w:r>
           </w:p>
           <w:p>
@@ -2307,19 +2231,7 @@
                 <w:rFonts w:ascii="Times New Roman" w:hAnsi="Times New Roman"/>
                 <w:sz w:val="17"/>
               </w:rPr>
-            </w:r>
-          </w:p>
-          <w:p>
-            <w:pPr>
-              <w:pStyle w:val="ListBullet"/>
-              <w:spacing w:after="20" w:before="0" w:line="240" w:lineRule="auto"/>
-            </w:pPr>
-            <w:r>
-              <w:rPr>
-                <w:rFonts w:ascii="Times New Roman" w:hAnsi="Times New Roman"/>
-                <w:sz w:val="17"/>
-              </w:rPr>
-              <w:t>Đặc tả nghiệp vụ tính lương.</w:t>
+              <w:t>• Đặc tả nghiệp vụ tính lương.</w:t>
             </w:r>
           </w:p>
           <w:p>
@@ -2483,19 +2395,7 @@
                 <w:rFonts w:ascii="Times New Roman" w:hAnsi="Times New Roman"/>
                 <w:sz w:val="17"/>
               </w:rPr>
-            </w:r>
-          </w:p>
-          <w:p>
-            <w:pPr>
-              <w:pStyle w:val="ListBullet"/>
-              <w:spacing w:after="20" w:before="0" w:line="240" w:lineRule="auto"/>
-            </w:pPr>
-            <w:r>
-              <w:rPr>
-                <w:rFonts w:ascii="Times New Roman" w:hAnsi="Times New Roman"/>
-                <w:sz w:val="17"/>
-              </w:rPr>
-              <w:t>Chốt kiến trúc Java Swing → Service → DAO/JDBC → SQL Server và cấu trúc thư mục dự án.</w:t>
+              <w:t>• Chốt kiến trúc Java Swing → Service → DAO/JDBC → SQL Server và cấu trúc thư mục dự án.</w:t>
             </w:r>
           </w:p>
           <w:p>
@@ -2596,19 +2496,7 @@
                 <w:rFonts w:ascii="Times New Roman" w:hAnsi="Times New Roman"/>
                 <w:sz w:val="17"/>
               </w:rPr>
-            </w:r>
-          </w:p>
-          <w:p>
-            <w:pPr>
-              <w:pStyle w:val="ListBullet"/>
-              <w:spacing w:after="20" w:before="0" w:line="240" w:lineRule="auto"/>
-            </w:pPr>
-            <w:r>
-              <w:rPr>
-                <w:rFonts w:ascii="Times New Roman" w:hAnsi="Times New Roman"/>
-                <w:sz w:val="17"/>
-              </w:rPr>
-              <w:t>Architecture diagram.</w:t>
+              <w:t>• Architecture diagram.</w:t>
             </w:r>
           </w:p>
           <w:p>
@@ -2996,6 +2884,7 @@
                 <w:rFonts w:ascii="Times New Roman" w:hAnsi="Times New Roman"/>
                 <w:sz w:val="17"/>
               </w:rPr>
+              <w:t>• Cài đặt DDL/constraint cho PHONGBAN, CHUCVU, NHANVIEN và các khóa ngoại liên quan.</w:t>
             </w:r>
           </w:p>
           <w:p>
@@ -3008,20 +2897,7 @@
                 <w:rFonts w:ascii="Times New Roman" w:hAnsi="Times New Roman"/>
                 <w:sz w:val="17"/>
               </w:rPr>
-              <w:t>Cài đặt DDL/constraint cho PHONGBAN, CHUCVU, NHANVIEN và các khóa ngoại liên quan.</w:t>
-            </w:r>
-          </w:p>
-          <w:p>
-            <w:pPr>
-              <w:pStyle w:val="ListBullet"/>
-              <w:spacing w:after="20" w:before="0" w:line="240" w:lineRule="auto"/>
-            </w:pPr>
-            <w:r>
-              <w:rPr>
-                <w:rFonts w:ascii="Times New Roman" w:hAnsi="Times New Roman"/>
-                <w:sz w:val="17"/>
-              </w:rPr>
-              <w:t>Cài đặt sp_ThemNhanVien; phối hợp kiểm thử sp_CapNhatNhanVien.</w:t>
+              <w:t>Cài đặt sp_ThemNhanVien; phối hợp kiểm thử cập nhật hồ sơ qua NhanVienDAO.</w:t>
             </w:r>
           </w:p>
           <w:p>
@@ -3109,19 +2985,7 @@
                 <w:rFonts w:ascii="Times New Roman" w:hAnsi="Times New Roman"/>
                 <w:sz w:val="17"/>
               </w:rPr>
-            </w:r>
-          </w:p>
-          <w:p>
-            <w:pPr>
-              <w:pStyle w:val="ListBullet"/>
-              <w:spacing w:after="20" w:before="0" w:line="240" w:lineRule="auto"/>
-            </w:pPr>
-            <w:r>
-              <w:rPr>
-                <w:rFonts w:ascii="Times New Roman" w:hAnsi="Times New Roman"/>
-                <w:sz w:val="17"/>
-              </w:rPr>
-              <w:t>SQL script module nhân sự.</w:t>
+              <w:t>• SQL script module nhân sự.</w:t>
             </w:r>
           </w:p>
           <w:p>
@@ -3285,32 +3149,7 @@
                 <w:rFonts w:ascii="Times New Roman" w:hAnsi="Times New Roman"/>
                 <w:sz w:val="17"/>
               </w:rPr>
-            </w:r>
-          </w:p>
-          <w:p>
-            <w:pPr>
-              <w:pStyle w:val="ListBullet"/>
-              <w:spacing w:after="20" w:before="0" w:line="240" w:lineRule="auto"/>
-            </w:pPr>
-            <w:r>
-              <w:rPr>
-                <w:rFonts w:ascii="Times New Roman" w:hAnsi="Times New Roman"/>
-                <w:sz w:val="17"/>
-              </w:rPr>
-              <w:t>Cài đặt sp_CapNhatNhanVien theo phân công SQL chung và phối hợp TV1 kiểm thử liên kết dữ liệu.</w:t>
-            </w:r>
-          </w:p>
-          <w:p>
-            <w:pPr>
-              <w:pStyle w:val="ListBullet"/>
-              <w:spacing w:after="20" w:before="0" w:line="240" w:lineRule="auto"/>
-            </w:pPr>
-            <w:r>
-              <w:rPr>
-                <w:rFonts w:ascii="Times New Roman" w:hAnsi="Times New Roman"/>
-                <w:sz w:val="17"/>
-              </w:rPr>
-              <w:t>Cài đặt fn_TongPhuCap, trg_ChamCong_KiemTraNhanVien, vw_TongHopChamCongThang, IX_CHAMCONG_MaNV_Ngay.</w:t>
+              <w:t>• Cài đặt sp_GhiNhanChamCong; phối hợp TV3 cài đặt fn_TongPhuCap (module 03); cài đặt trg_ChamCong_KiemTraGio và trg_ChamCong_KiemTraNhanVien; cài đặt vw_TongHopChamCongThang, IX_CHAMCONG_MaNV_Ngay.</w:t>
             </w:r>
           </w:p>
           <w:p>
@@ -3398,19 +3237,7 @@
                 <w:rFonts w:ascii="Times New Roman" w:hAnsi="Times New Roman"/>
                 <w:sz w:val="17"/>
               </w:rPr>
-            </w:r>
-          </w:p>
-          <w:p>
-            <w:pPr>
-              <w:pStyle w:val="ListBullet"/>
-              <w:spacing w:after="20" w:before="0" w:line="240" w:lineRule="auto"/>
-            </w:pPr>
-            <w:r>
-              <w:rPr>
-                <w:rFonts w:ascii="Times New Roman" w:hAnsi="Times New Roman"/>
-                <w:sz w:val="17"/>
-              </w:rPr>
-              <w:t>SQL objects theo phân công.</w:t>
+              <w:t>• SQL objects theo phân công.</w:t>
             </w:r>
           </w:p>
           <w:p>
@@ -3574,6 +3401,7 @@
                 <w:rFonts w:ascii="Times New Roman" w:hAnsi="Times New Roman"/>
                 <w:sz w:val="17"/>
               </w:rPr>
+              <w:t>• Cài đặt DDL/Constraints cho PHUCAPNHANVIEN, KHAUTRUNHANVIEN.</w:t>
             </w:r>
           </w:p>
           <w:p>
@@ -3586,7 +3414,7 @@
                 <w:rFonts w:ascii="Times New Roman" w:hAnsi="Times New Roman"/>
                 <w:sz w:val="17"/>
               </w:rPr>
-              <w:t>Cài đặt sp_GhiNhanChamCong và phối hợp TV2 tích hợp vào ứng dụng.</w:t>
+              <w:t>Cài đặt fn_TongKhauTru, trg_PhuCap_KhongSuaKhiDaChotLuong, vw_TongPhuCapThang, IX_PHUCAP_MaNV_ThangNam.</w:t>
             </w:r>
           </w:p>
           <w:p>
@@ -3599,7 +3427,7 @@
                 <w:rFonts w:ascii="Times New Roman" w:hAnsi="Times New Roman"/>
                 <w:sz w:val="17"/>
               </w:rPr>
-              <w:t>Cài đặt fn_TongKhauTru, trg_ChamCong_KiemTraGio, vw_TongPhuCapThang, IX_PHUCAP_MaNV_ThangNam.</w:t>
+              <w:t>Xây dựng giao diện/module quản lý phụ cấp và khấu trừ (PhuCapKhauTruPanel), gồm nhập dữ liệu, lọc theo kỳ, tải lại từ CSDL.</w:t>
             </w:r>
           </w:p>
           <w:p>
@@ -3612,20 +3440,7 @@
                 <w:rFonts w:ascii="Times New Roman" w:hAnsi="Times New Roman"/>
                 <w:sz w:val="17"/>
               </w:rPr>
-              <w:t>Xây dựng giao diện/module quản lý phụ cấp và khấu trừ, gồm nhập dữ liệu, lọc theo kỳ, tải lại từ CSDL.</w:t>
-            </w:r>
-          </w:p>
-          <w:p>
-            <w:pPr>
-              <w:pStyle w:val="ListBullet"/>
-              <w:spacing w:after="20" w:before="0" w:line="240" w:lineRule="auto"/>
-            </w:pPr>
-            <w:r>
-              <w:rPr>
-                <w:rFonts w:ascii="Times New Roman" w:hAnsi="Times New Roman"/>
-                <w:sz w:val="17"/>
-              </w:rPr>
-              <w:t>Cài đặt và kiểm thử transaction xóa kỳ lương chưa chốt: xóa chi tiết trước, xóa kỳ sau, rollback khi lỗi.</w:t>
+              <w:t>Cài đặt và kiểm thử transaction/SP sp_XoaKyLuongChuaChot: xóa chi tiết trước, xóa kỳ sau, rollback khi lỗi.</w:t>
             </w:r>
           </w:p>
           <w:p>
@@ -3687,19 +3502,7 @@
                 <w:rFonts w:ascii="Times New Roman" w:hAnsi="Times New Roman"/>
                 <w:sz w:val="17"/>
               </w:rPr>
-            </w:r>
-          </w:p>
-          <w:p>
-            <w:pPr>
-              <w:pStyle w:val="ListBullet"/>
-              <w:spacing w:after="20" w:before="0" w:line="240" w:lineRule="auto"/>
-            </w:pPr>
-            <w:r>
-              <w:rPr>
-                <w:rFonts w:ascii="Times New Roman" w:hAnsi="Times New Roman"/>
-                <w:sz w:val="17"/>
-              </w:rPr>
-              <w:t>SQL objects theo phân công.</w:t>
+              <w:t>• SQL objects theo phân công.</w:t>
             </w:r>
           </w:p>
           <w:p>
@@ -3863,19 +3666,7 @@
                 <w:rFonts w:ascii="Times New Roman" w:hAnsi="Times New Roman"/>
                 <w:sz w:val="17"/>
               </w:rPr>
-            </w:r>
-          </w:p>
-          <w:p>
-            <w:pPr>
-              <w:pStyle w:val="ListBullet"/>
-              <w:spacing w:after="20" w:before="0" w:line="240" w:lineRule="auto"/>
-            </w:pPr>
-            <w:r>
-              <w:rPr>
-                <w:rFonts w:ascii="Times New Roman" w:hAnsi="Times New Roman"/>
-                <w:sz w:val="17"/>
-              </w:rPr>
-              <w:t>Cài đặt sp_TinhBangLuongThang với TRY...CATCH, BEGIN TRAN/COMMIT/ROLLBACK.</w:t>
+              <w:t>• Cài đặt sp_TinhBangLuongThang với TRY...CATCH, BEGIN TRAN/COMMIT/ROLLBACK.</w:t>
             </w:r>
           </w:p>
           <w:p>
@@ -3976,19 +3767,7 @@
                 <w:rFonts w:ascii="Times New Roman" w:hAnsi="Times New Roman"/>
                 <w:sz w:val="17"/>
               </w:rPr>
-            </w:r>
-          </w:p>
-          <w:p>
-            <w:pPr>
-              <w:pStyle w:val="ListBullet"/>
-              <w:spacing w:after="20" w:before="0" w:line="240" w:lineRule="auto"/>
-            </w:pPr>
-            <w:r>
-              <w:rPr>
-                <w:rFonts w:ascii="Times New Roman" w:hAnsi="Times New Roman"/>
-                <w:sz w:val="17"/>
-              </w:rPr>
-              <w:t>Payroll Stored Procedure.</w:t>
+              <w:t>• Payroll Stored Procedure.</w:t>
             </w:r>
           </w:p>
           <w:p>
@@ -4152,19 +3931,7 @@
                 <w:rFonts w:ascii="Times New Roman" w:hAnsi="Times New Roman"/>
                 <w:sz w:val="17"/>
               </w:rPr>
-            </w:r>
-          </w:p>
-          <w:p>
-            <w:pPr>
-              <w:pStyle w:val="ListBullet"/>
-              <w:spacing w:after="20" w:before="0" w:line="240" w:lineRule="auto"/>
-            </w:pPr>
-            <w:r>
-              <w:rPr>
-                <w:rFonts w:ascii="Times New Roman" w:hAnsi="Times New Roman"/>
-                <w:sz w:val="17"/>
-              </w:rPr>
-              <w:t>Cài đặt sp_ChotBangLuong, fn_TinhThucNhan, trg_ChiTietLuong_KhongSuaKhiDaChot, vw_BangLuongChiTiet, IX_NHANVIEN_MaPB_MaCV.</w:t>
+              <w:t>• Cài đặt sp_ChotBangLuong, fn_TinhThucNhan, trg_ChiTietLuong_KhongSuaKhiDaChot, vw_BangLuongChiTiet, IX_NHANVIEN_MaPB_MaCV.</w:t>
             </w:r>
           </w:p>
           <w:p>
@@ -4265,19 +4032,7 @@
                 <w:rFonts w:ascii="Times New Roman" w:hAnsi="Times New Roman"/>
                 <w:sz w:val="17"/>
               </w:rPr>
-            </w:r>
-          </w:p>
-          <w:p>
-            <w:pPr>
-              <w:pStyle w:val="ListBullet"/>
-              <w:spacing w:after="20" w:before="0" w:line="240" w:lineRule="auto"/>
-            </w:pPr>
-            <w:r>
-              <w:rPr>
-                <w:rFonts w:ascii="Times New Roman" w:hAnsi="Times New Roman"/>
-                <w:sz w:val="17"/>
-              </w:rPr>
-              <w:t>Login/phân quyền hoạt động.</w:t>
+              <w:t>• Login/phân quyền hoạt động.</w:t>
             </w:r>
           </w:p>
           <w:p>
@@ -4678,19 +4433,7 @@
                 <w:rFonts w:ascii="Times New Roman" w:hAnsi="Times New Roman"/>
                 <w:sz w:val="17"/>
               </w:rPr>
-            </w:r>
-          </w:p>
-          <w:p>
-            <w:pPr>
-              <w:pStyle w:val="ListBullet"/>
-              <w:spacing w:after="20" w:before="0" w:line="240" w:lineRule="auto"/>
-            </w:pPr>
-            <w:r>
-              <w:rPr>
-                <w:rFonts w:ascii="Times New Roman" w:hAnsi="Times New Roman"/>
-                <w:sz w:val="17"/>
-              </w:rPr>
-              <w:t>Rà soát toàn bộ ERD, PK/FK, mô tả bảng và chuẩn hóa 3NF sau khi code thực tế đã ổn định.</w:t>
+              <w:t>• Rà soát toàn bộ ERD, PK/FK, mô tả bảng và chuẩn hóa 3NF sau khi code thực tế đã ổn định.</w:t>
             </w:r>
           </w:p>
           <w:p>
@@ -4778,19 +4521,7 @@
                 <w:rFonts w:ascii="Times New Roman" w:hAnsi="Times New Roman"/>
                 <w:sz w:val="17"/>
               </w:rPr>
-            </w:r>
-          </w:p>
-          <w:p>
-            <w:pPr>
-              <w:pStyle w:val="ListBullet"/>
-              <w:spacing w:after="20" w:before="0" w:line="240" w:lineRule="auto"/>
-            </w:pPr>
-            <w:r>
-              <w:rPr>
-                <w:rFonts w:ascii="Times New Roman" w:hAnsi="Times New Roman"/>
-                <w:sz w:val="17"/>
-              </w:rPr>
-              <w:t>ERD và schema cuối.</w:t>
+              <w:t>• ERD và schema cuối.</w:t>
             </w:r>
           </w:p>
           <w:p>
@@ -4954,19 +4685,7 @@
                 <w:rFonts w:ascii="Times New Roman" w:hAnsi="Times New Roman"/>
                 <w:sz w:val="17"/>
               </w:rPr>
-            </w:r>
-          </w:p>
-          <w:p>
-            <w:pPr>
-              <w:pStyle w:val="ListBullet"/>
-              <w:spacing w:after="20" w:before="0" w:line="240" w:lineRule="auto"/>
-            </w:pPr>
-            <w:r>
-              <w:rPr>
-                <w:rFonts w:ascii="Times New Roman" w:hAnsi="Times New Roman"/>
-                <w:sz w:val="17"/>
-              </w:rPr>
-              <w:t>Test module chấm công với dữ liệu hợp lệ/không hợp lệ và transaction nhập lô.</w:t>
+              <w:t>• Test module chấm công với dữ liệu hợp lệ/không hợp lệ và transaction nhập lô.</w:t>
             </w:r>
           </w:p>
           <w:p>
@@ -5054,19 +4773,7 @@
                 <w:rFonts w:ascii="Times New Roman" w:hAnsi="Times New Roman"/>
                 <w:sz w:val="17"/>
               </w:rPr>
-            </w:r>
-          </w:p>
-          <w:p>
-            <w:pPr>
-              <w:pStyle w:val="ListBullet"/>
-              <w:spacing w:after="20" w:before="0" w:line="240" w:lineRule="auto"/>
-            </w:pPr>
-            <w:r>
-              <w:rPr>
-                <w:rFonts w:ascii="Times New Roman" w:hAnsi="Times New Roman"/>
-                <w:sz w:val="17"/>
-              </w:rPr>
-              <w:t>Test report chấm công.</w:t>
+              <w:t>• Test report chấm công.</w:t>
             </w:r>
           </w:p>
           <w:p>
@@ -5230,19 +4937,7 @@
                 <w:rFonts w:ascii="Times New Roman" w:hAnsi="Times New Roman"/>
                 <w:sz w:val="17"/>
               </w:rPr>
-            </w:r>
-          </w:p>
-          <w:p>
-            <w:pPr>
-              <w:pStyle w:val="ListBullet"/>
-              <w:spacing w:after="20" w:before="0" w:line="240" w:lineRule="auto"/>
-            </w:pPr>
-            <w:r>
-              <w:rPr>
-                <w:rFonts w:ascii="Times New Roman" w:hAnsi="Times New Roman"/>
-                <w:sz w:val="17"/>
-              </w:rPr>
-              <w:t>Test Function/View phụ cấp – khấu trừ trên nhiều kỳ và nhiều nhân viên.</w:t>
+              <w:t>• Test Function/View phụ cấp – khấu trừ trên nhiều kỳ và nhiều nhân viên.</w:t>
             </w:r>
           </w:p>
           <w:p>
@@ -5330,19 +5025,7 @@
                 <w:rFonts w:ascii="Times New Roman" w:hAnsi="Times New Roman"/>
                 <w:sz w:val="17"/>
               </w:rPr>
-            </w:r>
-          </w:p>
-          <w:p>
-            <w:pPr>
-              <w:pStyle w:val="ListBullet"/>
-              <w:spacing w:after="20" w:before="0" w:line="240" w:lineRule="auto"/>
-            </w:pPr>
-            <w:r>
-              <w:rPr>
-                <w:rFonts w:ascii="Times New Roman" w:hAnsi="Times New Roman"/>
-                <w:sz w:val="17"/>
-              </w:rPr>
-              <w:t>Test report phụ cấp/khấu trừ.</w:t>
+              <w:t>• Test report phụ cấp/khấu trừ.</w:t>
             </w:r>
           </w:p>
           <w:p>
@@ -5506,19 +5189,7 @@
                 <w:rFonts w:ascii="Times New Roman" w:hAnsi="Times New Roman"/>
                 <w:sz w:val="17"/>
               </w:rPr>
-            </w:r>
-          </w:p>
-          <w:p>
-            <w:pPr>
-              <w:pStyle w:val="ListBullet"/>
-              <w:spacing w:after="20" w:before="0" w:line="240" w:lineRule="auto"/>
-            </w:pPr>
-            <w:r>
-              <w:rPr>
-                <w:rFonts w:ascii="Times New Roman" w:hAnsi="Times New Roman"/>
-                <w:sz w:val="17"/>
-              </w:rPr>
-              <w:t>Test end-to-end: dữ liệu nguồn → tính lương → tạo chi tiết → rollback khi lỗi → tính lại thành công.</w:t>
+              <w:t>• Test end-to-end: dữ liệu nguồn → tính lương → tạo chi tiết → rollback khi lỗi → tính lại thành công.</w:t>
             </w:r>
           </w:p>
           <w:p>
@@ -5606,19 +5277,7 @@
                 <w:rFonts w:ascii="Times New Roman" w:hAnsi="Times New Roman"/>
                 <w:sz w:val="17"/>
               </w:rPr>
-            </w:r>
-          </w:p>
-          <w:p>
-            <w:pPr>
-              <w:pStyle w:val="ListBullet"/>
-              <w:spacing w:after="20" w:before="0" w:line="240" w:lineRule="auto"/>
-            </w:pPr>
-            <w:r>
-              <w:rPr>
-                <w:rFonts w:ascii="Times New Roman" w:hAnsi="Times New Roman"/>
-                <w:sz w:val="17"/>
-              </w:rPr>
-              <w:t>Test report payroll.</w:t>
+              <w:t>• Test report payroll.</w:t>
             </w:r>
           </w:p>
           <w:p>
@@ -5782,19 +5441,7 @@
                 <w:rFonts w:ascii="Times New Roman" w:hAnsi="Times New Roman"/>
                 <w:sz w:val="17"/>
               </w:rPr>
-            </w:r>
-          </w:p>
-          <w:p>
-            <w:pPr>
-              <w:pStyle w:val="ListBullet"/>
-              <w:spacing w:after="20" w:before="0" w:line="240" w:lineRule="auto"/>
-            </w:pPr>
-            <w:r>
-              <w:rPr>
-                <w:rFonts w:ascii="Times New Roman" w:hAnsi="Times New Roman"/>
-                <w:sz w:val="17"/>
-              </w:rPr>
-              <w:t>Integration test toàn hệ thống: login → nhân sự → chấm công → phụ cấp/khấu trừ → tính lương → chốt → báo cáo.</w:t>
+              <w:t>• Integration test toàn hệ thống: login → nhân sự → chấm công → phụ cấp/khấu trừ → tính lương → chốt → báo cáo.</w:t>
             </w:r>
           </w:p>
           <w:p>
@@ -5895,19 +5542,7 @@
                 <w:rFonts w:ascii="Times New Roman" w:hAnsi="Times New Roman"/>
                 <w:sz w:val="17"/>
               </w:rPr>
-            </w:r>
-          </w:p>
-          <w:p>
-            <w:pPr>
-              <w:pStyle w:val="ListBullet"/>
-              <w:spacing w:after="20" w:before="0" w:line="240" w:lineRule="auto"/>
-            </w:pPr>
-            <w:r>
-              <w:rPr>
-                <w:rFonts w:ascii="Times New Roman" w:hAnsi="Times New Roman"/>
-                <w:sz w:val="17"/>
-              </w:rPr>
-              <w:t>Bản release tích hợp.</w:t>
+              <w:t>• Bản release tích hợp.</w:t>
             </w:r>
           </w:p>
           <w:p>
@@ -6254,7 +5889,7 @@
             <w:r>
               <w:rPr>
                 <w:rFonts w:ascii="Times New Roman" w:hAnsi="Times New Roman"/>
-                <w:sz w:val="17"/>
+                <w:sz w:val="18"/>
               </w:rPr>
               <w:t>TV1 – Nguyễn Minh Trí</w:t>
             </w:r>
@@ -6278,7 +5913,7 @@
             <w:r>
               <w:rPr>
                 <w:rFonts w:ascii="Times New Roman" w:hAnsi="Times New Roman"/>
-                <w:sz w:val="17"/>
+                <w:sz w:val="18"/>
               </w:rPr>
               <w:t>sp_ThemNhanVien</w:t>
             </w:r>
@@ -6302,7 +5937,7 @@
             <w:r>
               <w:rPr>
                 <w:rFonts w:ascii="Times New Roman" w:hAnsi="Times New Roman"/>
-                <w:sz w:val="17"/>
+                <w:sz w:val="18"/>
               </w:rPr>
               <w:t>fn_TinhSoNgayCong</w:t>
             </w:r>
@@ -6326,7 +5961,7 @@
             <w:r>
               <w:rPr>
                 <w:rFonts w:ascii="Times New Roman" w:hAnsi="Times New Roman"/>
-                <w:sz w:val="17"/>
+                <w:sz w:val="18"/>
               </w:rPr>
               <w:t>trg_NhanVien_KhongXoaKhiDaPhatSinhLuong</w:t>
             </w:r>
@@ -6350,7 +5985,7 @@
             <w:r>
               <w:rPr>
                 <w:rFonts w:ascii="Times New Roman" w:hAnsi="Times New Roman"/>
-                <w:sz w:val="17"/>
+                <w:sz w:val="18"/>
               </w:rPr>
               <w:t>vw_NhanVien_PhongBan_ChucVu</w:t>
             </w:r>
@@ -6374,7 +6009,7 @@
             <w:r>
               <w:rPr>
                 <w:rFonts w:ascii="Times New Roman" w:hAnsi="Times New Roman"/>
-                <w:sz w:val="17"/>
+                <w:sz w:val="18"/>
               </w:rPr>
               <w:t>IX_NHANVIEN_HoTen</w:t>
             </w:r>
@@ -6398,7 +6033,7 @@
             <w:r>
               <w:rPr>
                 <w:rFonts w:ascii="Times New Roman" w:hAnsi="Times New Roman"/>
-                <w:sz w:val="17"/>
+                <w:sz w:val="18"/>
               </w:rPr>
               <w:t>Tạo nhân viên + tài khoản</w:t>
             </w:r>
@@ -6424,7 +6059,7 @@
             <w:r>
               <w:rPr>
                 <w:rFonts w:ascii="Times New Roman" w:hAnsi="Times New Roman"/>
-                <w:sz w:val="17"/>
+                <w:sz w:val="18"/>
               </w:rPr>
               <w:t>TV2 – Phạm Minh Quân</w:t>
             </w:r>
@@ -6442,15 +6077,11 @@
             </w:tcMar>
           </w:tcPr>
           <w:p>
-            <w:pPr>
-              <w:spacing w:after="20" w:line="240" w:lineRule="auto"/>
-            </w:pPr>
-            <w:r>
-              <w:rPr>
-                <w:rFonts w:ascii="Times New Roman" w:hAnsi="Times New Roman"/>
-                <w:sz w:val="17"/>
-              </w:rPr>
-              <w:t>sp_CapNhatNhanVien</w:t>
+            <w:r>
+              <w:rPr>
+                <w:sz w:val="18"/>
+              </w:rPr>
+              <w:t>sp_GhiNhanChamCong</w:t>
             </w:r>
           </w:p>
         </w:tc>
@@ -6466,15 +6097,11 @@
             </w:tcMar>
           </w:tcPr>
           <w:p>
-            <w:pPr>
-              <w:spacing w:after="20" w:line="240" w:lineRule="auto"/>
-            </w:pPr>
-            <w:r>
-              <w:rPr>
-                <w:rFonts w:ascii="Times New Roman" w:hAnsi="Times New Roman"/>
-                <w:sz w:val="17"/>
-              </w:rPr>
-              <w:t>fn_TongPhuCap</w:t>
+            <w:r>
+              <w:rPr>
+                <w:sz w:val="18"/>
+              </w:rPr>
+              <w:t>fn_TongPhuCap (module 03)</w:t>
             </w:r>
           </w:p>
         </w:tc>
@@ -6496,9 +6123,9 @@
             <w:r>
               <w:rPr>
                 <w:rFonts w:ascii="Times New Roman" w:hAnsi="Times New Roman"/>
-                <w:sz w:val="17"/>
-              </w:rPr>
-              <w:t>trg_ChamCong_KiemTraNhanVien</w:t>
+                <w:sz w:val="18"/>
+              </w:rPr>
+              <w:t>trg_ChamCong_KiemTraGio; trg_ChamCong_KiemTraNhanVien</w:t>
             </w:r>
           </w:p>
         </w:tc>
@@ -6520,7 +6147,7 @@
             <w:r>
               <w:rPr>
                 <w:rFonts w:ascii="Times New Roman" w:hAnsi="Times New Roman"/>
-                <w:sz w:val="17"/>
+                <w:sz w:val="18"/>
               </w:rPr>
               <w:t>vw_TongHopChamCongThang</w:t>
             </w:r>
@@ -6544,7 +6171,7 @@
             <w:r>
               <w:rPr>
                 <w:rFonts w:ascii="Times New Roman" w:hAnsi="Times New Roman"/>
-                <w:sz w:val="17"/>
+                <w:sz w:val="18"/>
               </w:rPr>
               <w:t>IX_CHAMCONG_MaNV_Ngay</w:t>
             </w:r>
@@ -6568,7 +6195,7 @@
             <w:r>
               <w:rPr>
                 <w:rFonts w:ascii="Times New Roman" w:hAnsi="Times New Roman"/>
-                <w:sz w:val="17"/>
+                <w:sz w:val="18"/>
               </w:rPr>
               <w:t>Nhập chấm công theo lô</w:t>
             </w:r>
@@ -6594,7 +6221,7 @@
             <w:r>
               <w:rPr>
                 <w:rFonts w:ascii="Times New Roman" w:hAnsi="Times New Roman"/>
-                <w:sz w:val="17"/>
+                <w:sz w:val="18"/>
               </w:rPr>
               <w:t>TV3 – Trần Tiến Đạt</w:t>
             </w:r>
@@ -6612,15 +6239,11 @@
             </w:tcMar>
           </w:tcPr>
           <w:p>
-            <w:pPr>
-              <w:spacing w:after="20" w:line="240" w:lineRule="auto"/>
-            </w:pPr>
-            <w:r>
-              <w:rPr>
-                <w:rFonts w:ascii="Times New Roman" w:hAnsi="Times New Roman"/>
-                <w:sz w:val="17"/>
-              </w:rPr>
-              <w:t>sp_GhiNhanChamCong</w:t>
+            <w:r>
+              <w:rPr>
+                <w:sz w:val="18"/>
+              </w:rPr>
+              <w:t>sp_XoaKyLuongChuaChot</w:t>
             </w:r>
           </w:p>
         </w:tc>
@@ -6636,13 +6259,9 @@
             </w:tcMar>
           </w:tcPr>
           <w:p>
-            <w:pPr>
-              <w:spacing w:after="20" w:line="240" w:lineRule="auto"/>
-            </w:pPr>
-            <w:r>
-              <w:rPr>
-                <w:rFonts w:ascii="Times New Roman" w:hAnsi="Times New Roman"/>
-                <w:sz w:val="17"/>
+            <w:r>
+              <w:rPr>
+                <w:sz w:val="18"/>
               </w:rPr>
               <w:t>fn_TongKhauTru</w:t>
             </w:r>
@@ -6666,9 +6285,9 @@
             <w:r>
               <w:rPr>
                 <w:rFonts w:ascii="Times New Roman" w:hAnsi="Times New Roman"/>
-                <w:sz w:val="17"/>
-              </w:rPr>
-              <w:t>trg_ChamCong_KiemTraGio</w:t>
+                <w:sz w:val="18"/>
+              </w:rPr>
+              <w:t>trg_PhuCap_KhongSuaKhiDaChotLuong</w:t>
             </w:r>
           </w:p>
         </w:tc>
@@ -6690,7 +6309,7 @@
             <w:r>
               <w:rPr>
                 <w:rFonts w:ascii="Times New Roman" w:hAnsi="Times New Roman"/>
-                <w:sz w:val="17"/>
+                <w:sz w:val="18"/>
               </w:rPr>
               <w:t>vw_TongPhuCapThang</w:t>
             </w:r>
@@ -6714,7 +6333,7 @@
             <w:r>
               <w:rPr>
                 <w:rFonts w:ascii="Times New Roman" w:hAnsi="Times New Roman"/>
-                <w:sz w:val="17"/>
+                <w:sz w:val="18"/>
               </w:rPr>
               <w:t>IX_PHUCAP_MaNV_ThangNam</w:t>
             </w:r>
@@ -6738,7 +6357,7 @@
             <w:r>
               <w:rPr>
                 <w:rFonts w:ascii="Times New Roman" w:hAnsi="Times New Roman"/>
-                <w:sz w:val="17"/>
+                <w:sz w:val="18"/>
               </w:rPr>
               <w:t>Xóa kỳ lương chưa chốt</w:t>
             </w:r>
@@ -6764,7 +6383,7 @@
             <w:r>
               <w:rPr>
                 <w:rFonts w:ascii="Times New Roman" w:hAnsi="Times New Roman"/>
-                <w:sz w:val="17"/>
+                <w:sz w:val="18"/>
               </w:rPr>
               <w:t>TV4 – Nguyễn Quang Vinh</w:t>
             </w:r>
@@ -6788,7 +6407,7 @@
             <w:r>
               <w:rPr>
                 <w:rFonts w:ascii="Times New Roman" w:hAnsi="Times New Roman"/>
-                <w:sz w:val="17"/>
+                <w:sz w:val="18"/>
               </w:rPr>
               <w:t>sp_TinhBangLuongThang</w:t>
             </w:r>
@@ -6812,7 +6431,7 @@
             <w:r>
               <w:rPr>
                 <w:rFonts w:ascii="Times New Roman" w:hAnsi="Times New Roman"/>
-                <w:sz w:val="17"/>
+                <w:sz w:val="18"/>
               </w:rPr>
               <w:t>fn_TinhTienCong</w:t>
             </w:r>
@@ -6836,7 +6455,7 @@
             <w:r>
               <w:rPr>
                 <w:rFonts w:ascii="Times New Roman" w:hAnsi="Times New Roman"/>
-                <w:sz w:val="17"/>
+                <w:sz w:val="18"/>
               </w:rPr>
               <w:t>trg_BangLuong_KhongSuaKhiDaChot</w:t>
             </w:r>
@@ -6860,7 +6479,7 @@
             <w:r>
               <w:rPr>
                 <w:rFonts w:ascii="Times New Roman" w:hAnsi="Times New Roman"/>
-                <w:sz w:val="17"/>
+                <w:sz w:val="18"/>
               </w:rPr>
               <w:t>vw_TongKhauTruThang</w:t>
             </w:r>
@@ -6884,7 +6503,7 @@
             <w:r>
               <w:rPr>
                 <w:rFonts w:ascii="Times New Roman" w:hAnsi="Times New Roman"/>
-                <w:sz w:val="17"/>
+                <w:sz w:val="18"/>
               </w:rPr>
               <w:t>IX_KHAUTRU_MaNV_ThangNam</w:t>
             </w:r>
@@ -6908,7 +6527,7 @@
             <w:r>
               <w:rPr>
                 <w:rFonts w:ascii="Times New Roman" w:hAnsi="Times New Roman"/>
-                <w:sz w:val="17"/>
+                <w:sz w:val="18"/>
               </w:rPr>
               <w:t>Tính bảng lương tháng</w:t>
             </w:r>
@@ -6934,7 +6553,7 @@
             <w:r>
               <w:rPr>
                 <w:rFonts w:ascii="Times New Roman" w:hAnsi="Times New Roman"/>
-                <w:sz w:val="17"/>
+                <w:sz w:val="18"/>
               </w:rPr>
               <w:t>TV5 – Trần Đức Anh</w:t>
             </w:r>
@@ -6958,7 +6577,7 @@
             <w:r>
               <w:rPr>
                 <w:rFonts w:ascii="Times New Roman" w:hAnsi="Times New Roman"/>
-                <w:sz w:val="17"/>
+                <w:sz w:val="18"/>
               </w:rPr>
               <w:t>sp_ChotBangLuong</w:t>
             </w:r>
@@ -6982,7 +6601,7 @@
             <w:r>
               <w:rPr>
                 <w:rFonts w:ascii="Times New Roman" w:hAnsi="Times New Roman"/>
-                <w:sz w:val="17"/>
+                <w:sz w:val="18"/>
               </w:rPr>
               <w:t>fn_TinhThucNhan</w:t>
             </w:r>
@@ -7006,7 +6625,7 @@
             <w:r>
               <w:rPr>
                 <w:rFonts w:ascii="Times New Roman" w:hAnsi="Times New Roman"/>
-                <w:sz w:val="17"/>
+                <w:sz w:val="18"/>
               </w:rPr>
               <w:t>trg_ChiTietLuong_KhongSuaKhiDaChot</w:t>
             </w:r>
@@ -7030,7 +6649,7 @@
             <w:r>
               <w:rPr>
                 <w:rFonts w:ascii="Times New Roman" w:hAnsi="Times New Roman"/>
-                <w:sz w:val="17"/>
+                <w:sz w:val="18"/>
               </w:rPr>
               <w:t>vw_BangLuongChiTiet</w:t>
             </w:r>
@@ -7054,7 +6673,7 @@
             <w:r>
               <w:rPr>
                 <w:rFonts w:ascii="Times New Roman" w:hAnsi="Times New Roman"/>
-                <w:sz w:val="17"/>
+                <w:sz w:val="18"/>
               </w:rPr>
               <w:t>IX_NHANVIEN_MaPB_MaCV</w:t>
             </w:r>
@@ -7078,7 +6697,7 @@
             <w:r>
               <w:rPr>
                 <w:rFonts w:ascii="Times New Roman" w:hAnsi="Times New Roman"/>
-                <w:sz w:val="17"/>
+                <w:sz w:val="18"/>
               </w:rPr>
               <w:t>Chốt bảng lương</w:t>
             </w:r>
@@ -7258,7 +6877,7 @@
                 <w:rFonts w:ascii="Times New Roman" w:hAnsi="Times New Roman"/>
                 <w:sz w:val="18"/>
               </w:rPr>
-              <w:t>9 bảng; ERD/3NF do TV1 điều phối, cả nhóm rà soát</w:t>
+              <w:t>10 bảng gồm LICHSULUONG; ERD/3NF do TV1 điều phối, cả nhóm rà soát</w:t>
             </w:r>
           </w:p>
         </w:tc>

</xml_diff>